<commit_message>
Update to  resume - Added MongoDB
</commit_message>
<xml_diff>
--- a/public/Resume/Francisco_Acosta_Resume_2026.docx
+++ b/public/Resume/Francisco_Acosta_Resume_2026.docx
@@ -710,7 +710,34 @@
           <w:sz w:val="24"/>
           <w:szCs w:val="24"/>
         </w:rPr>
-        <w:t>C++, C#, Python, Java, SQL, Bash, PowerShell, HTML,</w:t>
+        <w:t xml:space="preserve">C++, C#, Python, Java, SQL, </w:t>
+      </w:r>
+      <w:r>
+        <w:rPr>
+          <w:rFonts w:ascii="Times New Roman" w:hAnsi="Times New Roman" w:cs="Times New Roman"/>
+          <w:color w:val="auto"/>
+          <w:sz w:val="24"/>
+          <w:szCs w:val="24"/>
+        </w:rPr>
+        <w:t>MongoDB</w:t>
+      </w:r>
+      <w:r>
+        <w:rPr>
+          <w:rFonts w:ascii="Times New Roman" w:hAnsi="Times New Roman" w:cs="Times New Roman"/>
+          <w:color w:val="auto"/>
+          <w:sz w:val="24"/>
+          <w:szCs w:val="24"/>
+        </w:rPr>
+        <w:t xml:space="preserve">, </w:t>
+      </w:r>
+      <w:r>
+        <w:rPr>
+          <w:rFonts w:ascii="Times New Roman" w:hAnsi="Times New Roman" w:cs="Times New Roman"/>
+          <w:color w:val="auto"/>
+          <w:sz w:val="24"/>
+          <w:szCs w:val="24"/>
+        </w:rPr>
+        <w:t>Bash, PowerShell, JavaScript,</w:t>
       </w:r>
       <w:r>
         <w:rPr>
@@ -728,16 +755,7 @@
           <w:sz w:val="24"/>
           <w:szCs w:val="24"/>
         </w:rPr>
-        <w:t>CSS, JavaScript,</w:t>
-      </w:r>
-      <w:r>
-        <w:rPr>
-          <w:rFonts w:ascii="Times New Roman" w:hAnsi="Times New Roman" w:cs="Times New Roman"/>
-          <w:color w:val="auto"/>
-          <w:sz w:val="24"/>
-          <w:szCs w:val="24"/>
-        </w:rPr>
-        <w:t xml:space="preserve"> and </w:t>
+        <w:t xml:space="preserve">and </w:t>
       </w:r>
       <w:r>
         <w:rPr>

</xml_diff>